<commit_message>
uv triple ektenia fix
</commit_message>
<xml_diff>
--- a/flow/20230914_vu_template/drafts/2024-12-g/02-ПН-Аввакума.docx
+++ b/flow/20230914_vu_template/drafts/2024-12-g/02-ПН-Аввакума.docx
@@ -70,6 +70,28 @@
       </w:pPr>
       <w:r>
         <w:rPr>
+          <w:rFonts w:ascii="Times New Roman" w:hAnsi="Times New Roman"/>
+          <w:i/>
+          <w:color w:val="FF0000"/>
+          <w:sz w:val="24"/>
+        </w:rPr>
+        <w:t>Священник:</w:t>
+      </w:r>
+      <w:r>
+        <w:rPr>
+          <w:rFonts w:ascii="Times New Roman" w:hAnsi="Times New Roman"/>
+          <w:sz w:val="24"/>
+        </w:rPr>
+        <w:t xml:space="preserve"> Благословенний Бог наш завжди, нині і повсякчас, і на віки віків.</w:t>
+      </w:r>
+    </w:p>
+    <w:p>
+      <w:pPr>
+        <w:spacing w:after="120" w:lineRule="auto"/>
+        <w:rPr/>
+      </w:pPr>
+      <w:r>
+        <w:rPr>
           <w:rFonts w:ascii="Times New Roman" w:cs="Times New Roman" w:eastAsia="Times New Roman" w:hAnsi="Times New Roman"/>
           <w:i w:val="1"/>
           <w:color w:val="ff0000"/>
@@ -77,28 +99,87 @@
           <w:szCs w:val="24"/>
           <w:rtl w:val="0"/>
         </w:rPr>
-        <w:t xml:space="preserve">Священник:</w:t>
-      </w:r>
-      <w:r>
-        <w:rPr>
-          <w:rFonts w:ascii="Times New Roman" w:cs="Times New Roman" w:eastAsia="Times New Roman" w:hAnsi="Times New Roman"/>
-          <w:sz w:val="24"/>
-          <w:szCs w:val="24"/>
-          <w:rtl w:val="0"/>
-        </w:rPr>
-        <w:t xml:space="preserve"> Благословенний Бог наш завжди, нині і повсякчас, і на віки віків.</w:t>
-      </w:r>
-      <w:r>
-        <w:rPr>
-          <w:rtl w:val="0"/>
-        </w:rPr>
-      </w:r>
-    </w:p>
-    <w:p>
-      <w:pPr>
-        <w:spacing w:after="120" w:lineRule="auto"/>
-        <w:rPr/>
-      </w:pPr>
+        <w:t xml:space="preserve">Вірні:</w:t>
+      </w:r>
+      <w:r>
+        <w:rPr>
+          <w:rFonts w:ascii="Times New Roman" w:cs="Times New Roman" w:eastAsia="Times New Roman" w:hAnsi="Times New Roman"/>
+          <w:color w:val="ff0000"/>
+          <w:sz w:val="24"/>
+          <w:szCs w:val="24"/>
+          <w:rtl w:val="0"/>
+        </w:rPr>
+        <w:t xml:space="preserve"> </w:t>
+      </w:r>
+      <w:r>
+        <w:rPr>
+          <w:rFonts w:ascii="Times New Roman" w:cs="Times New Roman" w:eastAsia="Times New Roman" w:hAnsi="Times New Roman"/>
+          <w:sz w:val="24"/>
+          <w:szCs w:val="24"/>
+          <w:rtl w:val="0"/>
+        </w:rPr>
+        <w:t xml:space="preserve">Амі́нь.</w:t>
+      </w:r>
+      <w:r>
+        <w:rPr>
+          <w:rtl w:val="0"/>
+        </w:rPr>
+      </w:r>
+    </w:p>
+    <w:p>
+      <w:pPr>
+        <w:spacing w:after="120" w:lineRule="auto"/>
+        <w:rPr/>
+      </w:pPr>
+      <w:r>
+        <w:rPr>
+          <w:rFonts w:ascii="Times New Roman" w:cs="Times New Roman" w:eastAsia="Times New Roman" w:hAnsi="Times New Roman"/>
+          <w:sz w:val="24"/>
+          <w:szCs w:val="24"/>
+          <w:rtl w:val="0"/>
+        </w:rPr>
+        <w:t xml:space="preserve">Сла́ва Тобі́, Бо́же наш, сла́ва Тобі́.</w:t>
+      </w:r>
+      <w:r>
+        <w:rPr>
+          <w:rtl w:val="0"/>
+        </w:rPr>
+      </w:r>
+    </w:p>
+    <w:p>
+      <w:pPr>
+        <w:spacing w:after="120" w:lineRule="auto"/>
+        <w:rPr/>
+      </w:pPr>
+      <w:r>
+        <w:rPr>
+          <w:rFonts w:ascii="Times New Roman" w:cs="Times New Roman" w:eastAsia="Times New Roman" w:hAnsi="Times New Roman"/>
+          <w:sz w:val="24"/>
+          <w:szCs w:val="24"/>
+          <w:rtl w:val="0"/>
+        </w:rPr>
+        <w:t xml:space="preserve">Ца́рю небе́сний, утіши́телю, Ду́ше íстини,* що всю́ди єси́ і все наповня́єш,* скарбни́це благ і життя́ пода́телю,* прийди́, і всели́ся в нас,* і очи́сти нас від уся́кої скве́рни,* і спаси́, благи́й, ду́ші на́ші.</w:t>
+      </w:r>
+      <w:r>
+        <w:rPr>
+          <w:rtl w:val="0"/>
+        </w:rPr>
+      </w:r>
+    </w:p>
+    <w:p>
+      <w:pPr>
+        <w:spacing w:after="120" w:lineRule="auto"/>
+        <w:rPr/>
+      </w:pPr>
+      <w:r>
+        <w:rPr>
+          <w:rFonts w:ascii="Times New Roman" w:cs="Times New Roman" w:eastAsia="Times New Roman" w:hAnsi="Times New Roman"/>
+          <w:sz w:val="24"/>
+          <w:szCs w:val="24"/>
+          <w:rtl w:val="0"/>
+        </w:rPr>
+        <w:t xml:space="preserve">Святи́й Бо́же, святи́й Крі́пкий, святи́й Безсме́ртний, поми́луй нас. </w:t>
+      </w:r>
       <w:r>
         <w:rPr>
           <w:rFonts w:ascii="Times New Roman" w:cs="Times New Roman" w:eastAsia="Times New Roman" w:hAnsi="Times New Roman"/>
@@ -108,86 +189,67 @@
           <w:szCs w:val="24"/>
           <w:rtl w:val="0"/>
         </w:rPr>
-        <w:t xml:space="preserve">Вірні:</w:t>
-      </w:r>
-      <w:r>
-        <w:rPr>
-          <w:rFonts w:ascii="Times New Roman" w:cs="Times New Roman" w:eastAsia="Times New Roman" w:hAnsi="Times New Roman"/>
-          <w:color w:val="ff0000"/>
-          <w:sz w:val="24"/>
-          <w:szCs w:val="24"/>
-          <w:rtl w:val="0"/>
-        </w:rPr>
-        <w:t xml:space="preserve"> </w:t>
-      </w:r>
-      <w:r>
-        <w:rPr>
-          <w:rFonts w:ascii="Times New Roman" w:cs="Times New Roman" w:eastAsia="Times New Roman" w:hAnsi="Times New Roman"/>
-          <w:sz w:val="24"/>
-          <w:szCs w:val="24"/>
-          <w:rtl w:val="0"/>
-        </w:rPr>
-        <w:t xml:space="preserve">Амі́нь.</w:t>
-      </w:r>
-      <w:r>
-        <w:rPr>
-          <w:rtl w:val="0"/>
-        </w:rPr>
-      </w:r>
-    </w:p>
-    <w:p>
-      <w:pPr>
-        <w:spacing w:after="120" w:lineRule="auto"/>
-        <w:rPr/>
-      </w:pPr>
-      <w:r>
-        <w:rPr>
-          <w:rFonts w:ascii="Times New Roman" w:cs="Times New Roman" w:eastAsia="Times New Roman" w:hAnsi="Times New Roman"/>
-          <w:sz w:val="24"/>
-          <w:szCs w:val="24"/>
-          <w:rtl w:val="0"/>
-        </w:rPr>
-        <w:t xml:space="preserve">Сла́ва Тобі́, Бо́же наш, сла́ва Тобі́.</w:t>
-      </w:r>
-      <w:r>
-        <w:rPr>
-          <w:rtl w:val="0"/>
-        </w:rPr>
-      </w:r>
-    </w:p>
-    <w:p>
-      <w:pPr>
-        <w:spacing w:after="120" w:lineRule="auto"/>
-        <w:rPr/>
-      </w:pPr>
-      <w:r>
-        <w:rPr>
-          <w:rFonts w:ascii="Times New Roman" w:cs="Times New Roman" w:eastAsia="Times New Roman" w:hAnsi="Times New Roman"/>
-          <w:sz w:val="24"/>
-          <w:szCs w:val="24"/>
-          <w:rtl w:val="0"/>
-        </w:rPr>
-        <w:t xml:space="preserve">Ца́рю небе́сний, утіши́телю, Ду́ше íстини,* що всю́ди єси́ і все наповня́єш,* скарбни́це благ і життя́ пода́телю,* прийди́, і всели́ся в нас,* і очи́сти нас від уся́кої скве́рни,* і спаси́, благи́й, ду́ші на́ші.</w:t>
-      </w:r>
-      <w:r>
-        <w:rPr>
-          <w:rtl w:val="0"/>
-        </w:rPr>
-      </w:r>
-    </w:p>
-    <w:p>
-      <w:pPr>
-        <w:spacing w:after="120" w:lineRule="auto"/>
-        <w:rPr/>
-      </w:pPr>
-      <w:r>
-        <w:rPr>
-          <w:rFonts w:ascii="Times New Roman" w:cs="Times New Roman" w:eastAsia="Times New Roman" w:hAnsi="Times New Roman"/>
-          <w:sz w:val="24"/>
-          <w:szCs w:val="24"/>
-          <w:rtl w:val="0"/>
-        </w:rPr>
-        <w:t xml:space="preserve">Святи́й Бо́же, святи́й Крі́пкий, святи́й Безсме́ртний, поми́луй нас. </w:t>
+        <w:t xml:space="preserve">(3 р.)</w:t>
+      </w:r>
+      <w:r>
+        <w:rPr>
+          <w:rtl w:val="0"/>
+        </w:rPr>
+      </w:r>
+    </w:p>
+    <w:p>
+      <w:pPr>
+        <w:spacing w:after="120" w:lineRule="auto"/>
+        <w:rPr/>
+      </w:pPr>
+      <w:r>
+        <w:rPr>
+          <w:rFonts w:ascii="Times New Roman" w:cs="Times New Roman" w:eastAsia="Times New Roman" w:hAnsi="Times New Roman"/>
+          <w:sz w:val="24"/>
+          <w:szCs w:val="24"/>
+          <w:rtl w:val="0"/>
+        </w:rPr>
+        <w:t xml:space="preserve">Сла́ва Отцю́, і Си́ну, і Свято́му Ду́хові,* і ни́ні, і повсякча́с, і на ві́ки вікі́в. Амі́нь.</w:t>
+      </w:r>
+      <w:r>
+        <w:rPr>
+          <w:rtl w:val="0"/>
+        </w:rPr>
+      </w:r>
+    </w:p>
+    <w:p>
+      <w:pPr>
+        <w:spacing w:after="120" w:lineRule="auto"/>
+        <w:rPr/>
+      </w:pPr>
+      <w:r>
+        <w:rPr>
+          <w:rFonts w:ascii="Times New Roman" w:cs="Times New Roman" w:eastAsia="Times New Roman" w:hAnsi="Times New Roman"/>
+          <w:sz w:val="24"/>
+          <w:szCs w:val="24"/>
+          <w:rtl w:val="0"/>
+        </w:rPr>
+        <w:t xml:space="preserve">Пресвята́ Тро́йце, поми́луй нас; Го́споди, очи́сти гріхи́ на́ші; Влади́ко, прости́ беззако́ння на́ші; Святи́й, завіта́й і зціли́ не́мочі на́ші, І́мени Твого́ ра́ди.</w:t>
+      </w:r>
+      <w:r>
+        <w:rPr>
+          <w:rtl w:val="0"/>
+        </w:rPr>
+      </w:r>
+    </w:p>
+    <w:p>
+      <w:pPr>
+        <w:spacing w:after="120" w:lineRule="auto"/>
+        <w:rPr/>
+      </w:pPr>
+      <w:r>
+        <w:rPr>
+          <w:rFonts w:ascii="Times New Roman" w:cs="Times New Roman" w:eastAsia="Times New Roman" w:hAnsi="Times New Roman"/>
+          <w:sz w:val="24"/>
+          <w:szCs w:val="24"/>
+          <w:rtl w:val="0"/>
+        </w:rPr>
+        <w:t xml:space="preserve">Го́споди, поми́луй. </w:t>
       </w:r>
       <w:r>
         <w:rPr>
@@ -238,77 +300,6 @@
           <w:szCs w:val="24"/>
           <w:rtl w:val="0"/>
         </w:rPr>
-        <w:t xml:space="preserve">Пресвята́ Тро́йце, поми́луй нас; Го́споди, очи́сти гріхи́ на́ші; Влади́ко, прости́ беззако́ння на́ші; Святи́й, завіта́й і зціли́ не́мочі на́ші, І́мени Твого́ ра́ди.</w:t>
-      </w:r>
-      <w:r>
-        <w:rPr>
-          <w:rtl w:val="0"/>
-        </w:rPr>
-      </w:r>
-    </w:p>
-    <w:p>
-      <w:pPr>
-        <w:spacing w:after="120" w:lineRule="auto"/>
-        <w:rPr/>
-      </w:pPr>
-      <w:r>
-        <w:rPr>
-          <w:rFonts w:ascii="Times New Roman" w:cs="Times New Roman" w:eastAsia="Times New Roman" w:hAnsi="Times New Roman"/>
-          <w:sz w:val="24"/>
-          <w:szCs w:val="24"/>
-          <w:rtl w:val="0"/>
-        </w:rPr>
-        <w:t xml:space="preserve">Го́споди, поми́луй. </w:t>
-      </w:r>
-      <w:r>
-        <w:rPr>
-          <w:rFonts w:ascii="Times New Roman" w:cs="Times New Roman" w:eastAsia="Times New Roman" w:hAnsi="Times New Roman"/>
-          <w:i w:val="1"/>
-          <w:color w:val="ff0000"/>
-          <w:sz w:val="24"/>
-          <w:szCs w:val="24"/>
-          <w:rtl w:val="0"/>
-        </w:rPr>
-        <w:t xml:space="preserve">(3 р.)</w:t>
-      </w:r>
-      <w:r>
-        <w:rPr>
-          <w:rtl w:val="0"/>
-        </w:rPr>
-      </w:r>
-    </w:p>
-    <w:p>
-      <w:pPr>
-        <w:spacing w:after="120" w:lineRule="auto"/>
-        <w:rPr/>
-      </w:pPr>
-      <w:r>
-        <w:rPr>
-          <w:rFonts w:ascii="Times New Roman" w:cs="Times New Roman" w:eastAsia="Times New Roman" w:hAnsi="Times New Roman"/>
-          <w:sz w:val="24"/>
-          <w:szCs w:val="24"/>
-          <w:rtl w:val="0"/>
-        </w:rPr>
-        <w:t xml:space="preserve">Сла́ва Отцю́, і Си́ну, і Свято́му Ду́хові,* і ни́ні, і повсякча́с, і на ві́ки вікі́в. Амі́нь.</w:t>
-      </w:r>
-      <w:r>
-        <w:rPr>
-          <w:rtl w:val="0"/>
-        </w:rPr>
-      </w:r>
-    </w:p>
-    <w:p>
-      <w:pPr>
-        <w:spacing w:after="120" w:lineRule="auto"/>
-        <w:rPr/>
-      </w:pPr>
-      <w:r>
-        <w:rPr>
-          <w:rFonts w:ascii="Times New Roman" w:cs="Times New Roman" w:eastAsia="Times New Roman" w:hAnsi="Times New Roman"/>
-          <w:sz w:val="24"/>
-          <w:szCs w:val="24"/>
-          <w:rtl w:val="0"/>
-        </w:rPr>
         <w:t xml:space="preserve">О́тче наш, що єси́ на небеса́х,* неха́й святи́ться ім’я́ Твоє́,* неха́й при́йде ца́рство Твоє́,* неха́й бу́де во́ля Твоя́, як на не́бі, так і на землі́.* Хліб наш насу́щний дай нам сього́дні;* і прости́ нам прови́ни на́ші,* як і ми проща́ємо винува́тцям на́шим;* і не введи́ нас у споку́су,* але́ ви́зволи нас від лука́вого.</w:t>
       </w:r>
       <w:r>
@@ -324,28 +315,19 @@
       </w:pPr>
       <w:r>
         <w:rPr>
-          <w:rFonts w:ascii="Times New Roman" w:cs="Times New Roman" w:eastAsia="Times New Roman" w:hAnsi="Times New Roman"/>
-          <w:i w:val="1"/>
-          <w:color w:val="ff0000"/>
-          <w:sz w:val="24"/>
-          <w:szCs w:val="24"/>
-          <w:rtl w:val="0"/>
-        </w:rPr>
-        <w:t xml:space="preserve">Священник:</w:t>
-      </w:r>
-      <w:r>
-        <w:rPr>
-          <w:rFonts w:ascii="Times New Roman" w:cs="Times New Roman" w:eastAsia="Times New Roman" w:hAnsi="Times New Roman"/>
-          <w:sz w:val="24"/>
-          <w:szCs w:val="24"/>
-          <w:rtl w:val="0"/>
+          <w:rFonts w:ascii="Times New Roman" w:hAnsi="Times New Roman"/>
+          <w:i/>
+          <w:color w:val="FF0000"/>
+          <w:sz w:val="24"/>
+        </w:rPr>
+        <w:t>Священник:</w:t>
+      </w:r>
+      <w:r>
+        <w:rPr>
+          <w:rFonts w:ascii="Times New Roman" w:hAnsi="Times New Roman"/>
+          <w:sz w:val="24"/>
         </w:rPr>
         <w:t xml:space="preserve"> Бо Твоє є царство, і сила, і слава, Отця, і Сина, і Святого Духа, нині, і повсякчас, і на віки віків.</w:t>
-      </w:r>
-      <w:r>
-        <w:rPr>
-          <w:rtl w:val="0"/>
-        </w:rPr>
       </w:r>
     </w:p>
     <w:p>
@@ -2506,28 +2488,19 @@
       </w:pPr>
       <w:r>
         <w:rPr>
-          <w:rFonts w:ascii="Times New Roman" w:cs="Times New Roman" w:eastAsia="Times New Roman" w:hAnsi="Times New Roman"/>
-          <w:i w:val="1"/>
-          <w:color w:val="ff0000"/>
-          <w:sz w:val="24"/>
-          <w:szCs w:val="24"/>
-          <w:rtl w:val="0"/>
-        </w:rPr>
-        <w:t xml:space="preserve">Священник:</w:t>
-      </w:r>
-      <w:r>
-        <w:rPr>
-          <w:rFonts w:ascii="Times New Roman" w:cs="Times New Roman" w:eastAsia="Times New Roman" w:hAnsi="Times New Roman"/>
-          <w:sz w:val="24"/>
-          <w:szCs w:val="24"/>
-          <w:rtl w:val="0"/>
+          <w:rFonts w:ascii="Times New Roman" w:hAnsi="Times New Roman"/>
+          <w:i/>
+          <w:color w:val="FF0000"/>
+          <w:sz w:val="24"/>
+        </w:rPr>
+        <w:t>Священник:</w:t>
+      </w:r>
+      <w:r>
+        <w:rPr>
+          <w:rFonts w:ascii="Times New Roman" w:hAnsi="Times New Roman"/>
+          <w:sz w:val="24"/>
         </w:rPr>
         <w:t xml:space="preserve"> Бо Тобі належить усяка слава, честь і поклоніння, Отцю, і Сину, і Святому Духові, нині, і повсякчас, і на віки віків.</w:t>
-      </w:r>
-      <w:r>
-        <w:rPr>
-          <w:rtl w:val="0"/>
-        </w:rPr>
       </w:r>
     </w:p>
     <w:p>
@@ -3794,28 +3767,19 @@
       </w:pPr>
       <w:r>
         <w:rPr>
-          <w:rFonts w:ascii="Times New Roman" w:cs="Times New Roman" w:eastAsia="Times New Roman" w:hAnsi="Times New Roman"/>
-          <w:i w:val="1"/>
-          <w:color w:val="ff0000"/>
-          <w:sz w:val="24"/>
-          <w:szCs w:val="24"/>
-          <w:rtl w:val="0"/>
-        </w:rPr>
-        <w:t xml:space="preserve">Священник:</w:t>
-      </w:r>
-      <w:r>
-        <w:rPr>
-          <w:rFonts w:ascii="Times New Roman" w:cs="Times New Roman" w:eastAsia="Times New Roman" w:hAnsi="Times New Roman"/>
-          <w:sz w:val="24"/>
-          <w:szCs w:val="24"/>
-          <w:rtl w:val="0"/>
+          <w:rFonts w:ascii="Times New Roman" w:hAnsi="Times New Roman"/>
+          <w:i/>
+          <w:color w:val="FF0000"/>
+          <w:sz w:val="24"/>
+        </w:rPr>
+        <w:t>Священник:</w:t>
+      </w:r>
+      <w:r>
+        <w:rPr>
+          <w:rFonts w:ascii="Times New Roman" w:hAnsi="Times New Roman"/>
+          <w:sz w:val="24"/>
         </w:rPr>
         <w:t xml:space="preserve"> Мир всім.</w:t>
-      </w:r>
-      <w:r>
-        <w:rPr>
-          <w:rtl w:val="0"/>
-        </w:rPr>
       </w:r>
     </w:p>
     <w:p>
@@ -4782,6 +4746,29 @@
       </w:pPr>
       <w:r>
         <w:rPr>
+          <w:rFonts w:ascii="Times New Roman" w:hAnsi="Times New Roman"/>
+          <w:i/>
+          <w:color w:val="FF0000"/>
+          <w:sz w:val="24"/>
+        </w:rPr>
+        <w:t>Священник:</w:t>
+      </w:r>
+      <w:r>
+        <w:rPr>
+          <w:rFonts w:ascii="Times New Roman" w:hAnsi="Times New Roman"/>
+          <w:sz w:val="24"/>
+        </w:rPr>
+        <w:t xml:space="preserve"> Бо Ти – Бог милости, ласк і людинолюбности, і Тобі славу возсилаємо, Отцю, і Сину, і Святому Духові, нині, і повсякчас, і на віки віків.</w:t>
+      </w:r>
+    </w:p>
+    <w:p>
+      <w:pPr>
+        <w:spacing w:after="120" w:lineRule="auto"/>
+        <w:jc w:val="both"/>
+        <w:rPr/>
+      </w:pPr>
+      <w:r>
+        <w:rPr>
           <w:rFonts w:ascii="Times New Roman" w:cs="Times New Roman" w:eastAsia="Times New Roman" w:hAnsi="Times New Roman"/>
           <w:i w:val="1"/>
           <w:color w:val="ff0000"/>
@@ -4789,21 +4776,54 @@
           <w:szCs w:val="24"/>
           <w:rtl w:val="0"/>
         </w:rPr>
-        <w:t xml:space="preserve">Священник:</w:t>
-      </w:r>
-      <w:r>
-        <w:rPr>
-          <w:rFonts w:ascii="Times New Roman" w:cs="Times New Roman" w:eastAsia="Times New Roman" w:hAnsi="Times New Roman"/>
-          <w:sz w:val="24"/>
-          <w:szCs w:val="24"/>
-          <w:rtl w:val="0"/>
-        </w:rPr>
-        <w:t xml:space="preserve"> Бо Ти – Бог милости, ласк і людинолюбности, і Тобі славу возсилаємо, Отцю, і Сину, і Святому Духові, нині, і повсякчас, і на віки віків.</w:t>
-      </w:r>
-      <w:r>
-        <w:rPr>
-          <w:rtl w:val="0"/>
-        </w:rPr>
+        <w:t xml:space="preserve">Вірні:</w:t>
+      </w:r>
+      <w:r>
+        <w:rPr>
+          <w:rFonts w:ascii="Times New Roman" w:cs="Times New Roman" w:eastAsia="Times New Roman" w:hAnsi="Times New Roman"/>
+          <w:color w:val="ff0000"/>
+          <w:sz w:val="24"/>
+          <w:szCs w:val="24"/>
+          <w:rtl w:val="0"/>
+        </w:rPr>
+        <w:t xml:space="preserve"> </w:t>
+      </w:r>
+      <w:r>
+        <w:rPr>
+          <w:rFonts w:ascii="Times New Roman" w:cs="Times New Roman" w:eastAsia="Times New Roman" w:hAnsi="Times New Roman"/>
+          <w:sz w:val="24"/>
+          <w:szCs w:val="24"/>
+          <w:rtl w:val="0"/>
+        </w:rPr>
+        <w:t xml:space="preserve">Амінь.</w:t>
+      </w:r>
+      <w:r>
+        <w:rPr>
+          <w:rtl w:val="0"/>
+        </w:rPr>
+      </w:r>
+    </w:p>
+    <w:p>
+      <w:pPr>
+        <w:spacing w:after="120" w:lineRule="auto"/>
+        <w:jc w:val="both"/>
+        <w:rPr/>
+      </w:pPr>
+      <w:r>
+        <w:rPr>
+          <w:rFonts w:ascii="Times New Roman" w:hAnsi="Times New Roman"/>
+          <w:i/>
+          <w:color w:val="FF0000"/>
+          <w:sz w:val="24"/>
+        </w:rPr>
+        <w:t>Священник:</w:t>
+      </w:r>
+      <w:r>
+        <w:rPr>
+          <w:rFonts w:ascii="Times New Roman" w:hAnsi="Times New Roman"/>
+          <w:sz w:val="24"/>
+        </w:rPr>
+        <w:t xml:space="preserve"> Мир всім.</w:t>
       </w:r>
     </w:p>
     <w:p>
@@ -4840,7 +4860,28 @@
           <w:szCs w:val="24"/>
           <w:rtl w:val="0"/>
         </w:rPr>
-        <w:t xml:space="preserve">Амінь.</w:t>
+        <w:t xml:space="preserve">І духові твоєму.</w:t>
+      </w:r>
+      <w:r>
+        <w:rPr>
+          <w:rtl w:val="0"/>
+        </w:rPr>
+      </w:r>
+    </w:p>
+    <w:p>
+      <w:pPr>
+        <w:spacing w:after="120" w:lineRule="auto"/>
+        <w:jc w:val="both"/>
+        <w:rPr/>
+      </w:pPr>
+      <w:r>
+        <w:rPr>
+          <w:rFonts w:ascii="Times New Roman" w:cs="Times New Roman" w:eastAsia="Times New Roman" w:hAnsi="Times New Roman"/>
+          <w:sz w:val="24"/>
+          <w:szCs w:val="24"/>
+          <w:rtl w:val="0"/>
+        </w:rPr>
+        <w:t xml:space="preserve">Голови ваші перед Господом схиліть.</w:t>
       </w:r>
       <w:r>
         <w:rPr>
@@ -4863,16 +4904,26 @@
           <w:szCs w:val="24"/>
           <w:rtl w:val="0"/>
         </w:rPr>
-        <w:t xml:space="preserve">Священник:</w:t>
-      </w:r>
-      <w:r>
-        <w:rPr>
-          <w:rFonts w:ascii="Times New Roman" w:cs="Times New Roman" w:eastAsia="Times New Roman" w:hAnsi="Times New Roman"/>
-          <w:sz w:val="24"/>
-          <w:szCs w:val="24"/>
-          <w:rtl w:val="0"/>
-        </w:rPr>
-        <w:t xml:space="preserve"> Мир всім.</w:t>
+        <w:t xml:space="preserve">Вірні:</w:t>
+      </w:r>
+      <w:r>
+        <w:rPr>
+          <w:rFonts w:ascii="Times New Roman" w:cs="Times New Roman" w:eastAsia="Times New Roman" w:hAnsi="Times New Roman"/>
+          <w:color w:val="ff0000"/>
+          <w:sz w:val="24"/>
+          <w:szCs w:val="24"/>
+          <w:rtl w:val="0"/>
+        </w:rPr>
+        <w:t xml:space="preserve"> </w:t>
+      </w:r>
+      <w:r>
+        <w:rPr>
+          <w:rFonts w:ascii="Times New Roman" w:cs="Times New Roman" w:eastAsia="Times New Roman" w:hAnsi="Times New Roman"/>
+          <w:sz w:val="24"/>
+          <w:szCs w:val="24"/>
+          <w:rtl w:val="0"/>
+        </w:rPr>
+        <w:t xml:space="preserve">Тобі, Господи.</w:t>
       </w:r>
       <w:r>
         <w:rPr>
@@ -4895,111 +4946,6 @@
           <w:szCs w:val="24"/>
           <w:rtl w:val="0"/>
         </w:rPr>
-        <w:t xml:space="preserve">Вірні:</w:t>
-      </w:r>
-      <w:r>
-        <w:rPr>
-          <w:rFonts w:ascii="Times New Roman" w:cs="Times New Roman" w:eastAsia="Times New Roman" w:hAnsi="Times New Roman"/>
-          <w:color w:val="ff0000"/>
-          <w:sz w:val="24"/>
-          <w:szCs w:val="24"/>
-          <w:rtl w:val="0"/>
-        </w:rPr>
-        <w:t xml:space="preserve"> </w:t>
-      </w:r>
-      <w:r>
-        <w:rPr>
-          <w:rFonts w:ascii="Times New Roman" w:cs="Times New Roman" w:eastAsia="Times New Roman" w:hAnsi="Times New Roman"/>
-          <w:sz w:val="24"/>
-          <w:szCs w:val="24"/>
-          <w:rtl w:val="0"/>
-        </w:rPr>
-        <w:t xml:space="preserve">І духові твоєму.</w:t>
-      </w:r>
-      <w:r>
-        <w:rPr>
-          <w:rtl w:val="0"/>
-        </w:rPr>
-      </w:r>
-    </w:p>
-    <w:p>
-      <w:pPr>
-        <w:spacing w:after="120" w:lineRule="auto"/>
-        <w:jc w:val="both"/>
-        <w:rPr/>
-      </w:pPr>
-      <w:r>
-        <w:rPr>
-          <w:rFonts w:ascii="Times New Roman" w:cs="Times New Roman" w:eastAsia="Times New Roman" w:hAnsi="Times New Roman"/>
-          <w:sz w:val="24"/>
-          <w:szCs w:val="24"/>
-          <w:rtl w:val="0"/>
-        </w:rPr>
-        <w:t xml:space="preserve">Голови ваші перед Господом схиліть.</w:t>
-      </w:r>
-      <w:r>
-        <w:rPr>
-          <w:rtl w:val="0"/>
-        </w:rPr>
-      </w:r>
-    </w:p>
-    <w:p>
-      <w:pPr>
-        <w:spacing w:after="120" w:lineRule="auto"/>
-        <w:jc w:val="both"/>
-        <w:rPr/>
-      </w:pPr>
-      <w:r>
-        <w:rPr>
-          <w:rFonts w:ascii="Times New Roman" w:cs="Times New Roman" w:eastAsia="Times New Roman" w:hAnsi="Times New Roman"/>
-          <w:i w:val="1"/>
-          <w:color w:val="ff0000"/>
-          <w:sz w:val="24"/>
-          <w:szCs w:val="24"/>
-          <w:rtl w:val="0"/>
-        </w:rPr>
-        <w:t xml:space="preserve">Вірні:</w:t>
-      </w:r>
-      <w:r>
-        <w:rPr>
-          <w:rFonts w:ascii="Times New Roman" w:cs="Times New Roman" w:eastAsia="Times New Roman" w:hAnsi="Times New Roman"/>
-          <w:color w:val="ff0000"/>
-          <w:sz w:val="24"/>
-          <w:szCs w:val="24"/>
-          <w:rtl w:val="0"/>
-        </w:rPr>
-        <w:t xml:space="preserve"> </w:t>
-      </w:r>
-      <w:r>
-        <w:rPr>
-          <w:rFonts w:ascii="Times New Roman" w:cs="Times New Roman" w:eastAsia="Times New Roman" w:hAnsi="Times New Roman"/>
-          <w:sz w:val="24"/>
-          <w:szCs w:val="24"/>
-          <w:rtl w:val="0"/>
-        </w:rPr>
-        <w:t xml:space="preserve">Тобі, Господи.</w:t>
-      </w:r>
-      <w:r>
-        <w:rPr>
-          <w:rtl w:val="0"/>
-        </w:rPr>
-      </w:r>
-    </w:p>
-    <w:p>
-      <w:pPr>
-        <w:spacing w:after="120" w:lineRule="auto"/>
-        <w:jc w:val="both"/>
-        <w:rPr/>
-      </w:pPr>
-      <w:r>
-        <w:rPr>
-          <w:rFonts w:ascii="Times New Roman" w:cs="Times New Roman" w:eastAsia="Times New Roman" w:hAnsi="Times New Roman"/>
-          <w:i w:val="1"/>
-          <w:color w:val="ff0000"/>
-          <w:sz w:val="24"/>
-          <w:szCs w:val="24"/>
-          <w:rtl w:val="0"/>
-        </w:rPr>
         <w:t xml:space="preserve">Священник читає молитву:</w:t>
       </w:r>
       <w:r>
@@ -5024,28 +4970,19 @@
       </w:pPr>
       <w:r>
         <w:rPr>
-          <w:rFonts w:ascii="Times New Roman" w:cs="Times New Roman" w:eastAsia="Times New Roman" w:hAnsi="Times New Roman"/>
-          <w:i w:val="1"/>
-          <w:color w:val="ff0000"/>
-          <w:sz w:val="24"/>
-          <w:szCs w:val="24"/>
-          <w:rtl w:val="0"/>
-        </w:rPr>
-        <w:t xml:space="preserve">Священник:</w:t>
-      </w:r>
-      <w:r>
-        <w:rPr>
-          <w:rFonts w:ascii="Times New Roman" w:cs="Times New Roman" w:eastAsia="Times New Roman" w:hAnsi="Times New Roman"/>
-          <w:sz w:val="24"/>
-          <w:szCs w:val="24"/>
-          <w:rtl w:val="0"/>
+          <w:rFonts w:ascii="Times New Roman" w:hAnsi="Times New Roman"/>
+          <w:i/>
+          <w:color w:val="FF0000"/>
+          <w:sz w:val="24"/>
+        </w:rPr>
+        <w:t>Священник:</w:t>
+      </w:r>
+      <w:r>
+        <w:rPr>
+          <w:rFonts w:ascii="Times New Roman" w:hAnsi="Times New Roman"/>
+          <w:sz w:val="24"/>
         </w:rPr>
         <w:t xml:space="preserve"> Нехай буде влада царства Твого благословенна і дуже прославлена: Отця, і Сина, і Святого Духа, нині і повсякчас, і на віки віків.</w:t>
-      </w:r>
-      <w:r>
-        <w:rPr>
-          <w:rtl w:val="0"/>
-        </w:rPr>
       </w:r>
     </w:p>
     <w:p>
@@ -5571,28 +5508,19 @@
       </w:pPr>
       <w:r>
         <w:rPr>
-          <w:rFonts w:ascii="Times New Roman" w:cs="Times New Roman" w:eastAsia="Times New Roman" w:hAnsi="Times New Roman"/>
-          <w:i w:val="1"/>
-          <w:color w:val="ff0000"/>
-          <w:sz w:val="24"/>
-          <w:szCs w:val="24"/>
-          <w:rtl w:val="0"/>
-        </w:rPr>
-        <w:t xml:space="preserve">Священник:</w:t>
-      </w:r>
-      <w:r>
-        <w:rPr>
-          <w:rFonts w:ascii="Times New Roman" w:cs="Times New Roman" w:eastAsia="Times New Roman" w:hAnsi="Times New Roman"/>
-          <w:sz w:val="24"/>
-          <w:szCs w:val="24"/>
-          <w:rtl w:val="0"/>
+          <w:rFonts w:ascii="Times New Roman" w:hAnsi="Times New Roman"/>
+          <w:i/>
+          <w:color w:val="FF0000"/>
+          <w:sz w:val="24"/>
+        </w:rPr>
+        <w:t>Священник:</w:t>
+      </w:r>
+      <w:r>
+        <w:rPr>
+          <w:rFonts w:ascii="Times New Roman" w:hAnsi="Times New Roman"/>
+          <w:sz w:val="24"/>
         </w:rPr>
         <w:t xml:space="preserve"> Бо Твоє є царство, і сила, і слава, Отця, і Сина, і Святого Духа, нині, і повсякчас, і на віки віків.</w:t>
-      </w:r>
-      <w:r>
-        <w:rPr>
-          <w:rtl w:val="0"/>
-        </w:rPr>
       </w:r>
     </w:p>
     <w:p>
@@ -6247,6 +6175,29 @@
       </w:pPr>
       <w:r>
         <w:rPr>
+          <w:rFonts w:ascii="Times New Roman" w:hAnsi="Times New Roman"/>
+          <w:i/>
+          <w:color w:val="FF0000"/>
+          <w:sz w:val="24"/>
+        </w:rPr>
+        <w:t>Священник:</w:t>
+      </w:r>
+      <w:r>
+        <w:rPr>
+          <w:rFonts w:ascii="Times New Roman" w:hAnsi="Times New Roman"/>
+          <w:sz w:val="24"/>
+        </w:rPr>
+        <w:t xml:space="preserve"> Бо милостивий і людинолюбний Бог єси, і Тобі славу возсилаємо, Отцю, і Сину, і Святому Духові, нині, і повсякчас, і на віки віків.</w:t>
+      </w:r>
+    </w:p>
+    <w:p>
+      <w:pPr>
+        <w:spacing w:after="120" w:lineRule="auto"/>
+        <w:jc w:val="both"/>
+        <w:rPr/>
+      </w:pPr>
+      <w:r>
+        <w:rPr>
           <w:rFonts w:ascii="Times New Roman" w:cs="Times New Roman" w:eastAsia="Times New Roman" w:hAnsi="Times New Roman"/>
           <w:i w:val="1"/>
           <w:color w:val="ff0000"/>
@@ -6254,27 +6205,28 @@
           <w:szCs w:val="24"/>
           <w:rtl w:val="0"/>
         </w:rPr>
-        <w:t xml:space="preserve">Священник:</w:t>
-      </w:r>
-      <w:r>
-        <w:rPr>
-          <w:rFonts w:ascii="Times New Roman" w:cs="Times New Roman" w:eastAsia="Times New Roman" w:hAnsi="Times New Roman"/>
-          <w:sz w:val="24"/>
-          <w:szCs w:val="24"/>
-          <w:rtl w:val="0"/>
-        </w:rPr>
-        <w:t xml:space="preserve"> Бо милостивий і людинолюбний Бог єси, і Тобі славу возсилаємо, Отцю, і Сину, і Святому Духові, нині, і повсякчас, і на віки віків.</w:t>
-      </w:r>
-      <w:r>
-        <w:rPr>
-          <w:rtl w:val="0"/>
-        </w:rPr>
-      </w:r>
-    </w:p>
-    <w:p>
-      <w:pPr>
-        <w:spacing w:after="120" w:lineRule="auto"/>
-        <w:jc w:val="both"/>
+        <w:t xml:space="preserve">Вірні:</w:t>
+      </w:r>
+      <w:r>
+        <w:rPr>
+          <w:rFonts w:ascii="Times New Roman" w:cs="Times New Roman" w:eastAsia="Times New Roman" w:hAnsi="Times New Roman"/>
+          <w:sz w:val="24"/>
+          <w:szCs w:val="24"/>
+          <w:rtl w:val="0"/>
+        </w:rPr>
+        <w:t xml:space="preserve"> Амінь.</w:t>
+      </w:r>
+      <w:r>
+        <w:rPr>
+          <w:rtl w:val="0"/>
+        </w:rPr>
+      </w:r>
+    </w:p>
+    <w:p>
+      <w:pPr>
+        <w:pStyle w:val="Heading2"/>
+        <w:spacing w:after="120" w:lineRule="auto"/>
+        <w:jc w:val="center"/>
         <w:rPr/>
       </w:pPr>
       <w:r>
@@ -6286,28 +6238,37 @@
           <w:szCs w:val="24"/>
           <w:rtl w:val="0"/>
         </w:rPr>
-        <w:t xml:space="preserve">Вірні:</w:t>
-      </w:r>
-      <w:r>
-        <w:rPr>
-          <w:rFonts w:ascii="Times New Roman" w:cs="Times New Roman" w:eastAsia="Times New Roman" w:hAnsi="Times New Roman"/>
-          <w:sz w:val="24"/>
-          <w:szCs w:val="24"/>
-          <w:rtl w:val="0"/>
-        </w:rPr>
-        <w:t xml:space="preserve"> Амінь.</w:t>
-      </w:r>
-      <w:r>
-        <w:rPr>
-          <w:rtl w:val="0"/>
-        </w:rPr>
-      </w:r>
-    </w:p>
-    <w:p>
-      <w:pPr>
-        <w:pStyle w:val="Heading2"/>
-        <w:spacing w:after="120" w:lineRule="auto"/>
-        <w:jc w:val="center"/>
+        <w:t xml:space="preserve">Середній відпуст</w:t>
+      </w:r>
+      <w:r>
+        <w:rPr>
+          <w:rtl w:val="0"/>
+        </w:rPr>
+      </w:r>
+    </w:p>
+    <w:p>
+      <w:pPr>
+        <w:spacing w:after="120" w:lineRule="auto"/>
+        <w:rPr/>
+      </w:pPr>
+      <w:r>
+        <w:rPr>
+          <w:rFonts w:ascii="Times New Roman" w:cs="Times New Roman" w:eastAsia="Times New Roman" w:hAnsi="Times New Roman"/>
+          <w:sz w:val="24"/>
+          <w:szCs w:val="24"/>
+          <w:rtl w:val="0"/>
+        </w:rPr>
+        <w:t xml:space="preserve">Прему́дрість!</w:t>
+      </w:r>
+      <w:r>
+        <w:rPr>
+          <w:rtl w:val="0"/>
+        </w:rPr>
+      </w:r>
+    </w:p>
+    <w:p>
+      <w:pPr>
+        <w:spacing w:after="120" w:lineRule="auto"/>
         <w:rPr/>
       </w:pPr>
       <w:r>
@@ -6319,32 +6280,53 @@
           <w:szCs w:val="24"/>
           <w:rtl w:val="0"/>
         </w:rPr>
-        <w:t xml:space="preserve">Середній відпуст</w:t>
-      </w:r>
-      <w:r>
-        <w:rPr>
-          <w:rtl w:val="0"/>
-        </w:rPr>
-      </w:r>
-    </w:p>
-    <w:p>
-      <w:pPr>
-        <w:spacing w:after="120" w:lineRule="auto"/>
-        <w:rPr/>
-      </w:pPr>
-      <w:r>
-        <w:rPr>
-          <w:rFonts w:ascii="Times New Roman" w:cs="Times New Roman" w:eastAsia="Times New Roman" w:hAnsi="Times New Roman"/>
-          <w:sz w:val="24"/>
-          <w:szCs w:val="24"/>
-          <w:rtl w:val="0"/>
-        </w:rPr>
-        <w:t xml:space="preserve">Прему́дрість!</w:t>
-      </w:r>
-      <w:r>
-        <w:rPr>
-          <w:rtl w:val="0"/>
-        </w:rPr>
+        <w:t xml:space="preserve">Вірні:</w:t>
+      </w:r>
+      <w:r>
+        <w:rPr>
+          <w:rFonts w:ascii="Times New Roman" w:cs="Times New Roman" w:eastAsia="Times New Roman" w:hAnsi="Times New Roman"/>
+          <w:color w:val="ff0000"/>
+          <w:sz w:val="24"/>
+          <w:szCs w:val="24"/>
+          <w:rtl w:val="0"/>
+        </w:rPr>
+        <w:t xml:space="preserve"> </w:t>
+      </w:r>
+      <w:r>
+        <w:rPr>
+          <w:rFonts w:ascii="Times New Roman" w:cs="Times New Roman" w:eastAsia="Times New Roman" w:hAnsi="Times New Roman"/>
+          <w:sz w:val="24"/>
+          <w:szCs w:val="24"/>
+          <w:rtl w:val="0"/>
+        </w:rPr>
+        <w:t xml:space="preserve">Чесні́шу від херуви́мів* і незрівня́нно славні́шу від серафи́мів,* що без зотлі́ння Бо́га Сло́во породи́ла,* су́щу Богоро́дицю, тебе́ велича́ємо.</w:t>
+      </w:r>
+      <w:r>
+        <w:rPr>
+          <w:rtl w:val="0"/>
+        </w:rPr>
+      </w:r>
+    </w:p>
+    <w:p>
+      <w:pPr>
+        <w:spacing w:after="120" w:lineRule="auto"/>
+        <w:rPr/>
+      </w:pPr>
+      <w:r>
+        <w:rPr>
+          <w:rFonts w:ascii="Times New Roman" w:hAnsi="Times New Roman"/>
+          <w:i/>
+          <w:color w:val="FF0000"/>
+          <w:sz w:val="24"/>
+        </w:rPr>
+        <w:t>Священник:</w:t>
+      </w:r>
+      <w:r>
+        <w:rPr>
+          <w:rFonts w:ascii="Times New Roman" w:hAnsi="Times New Roman"/>
+          <w:sz w:val="24"/>
+        </w:rPr>
+        <w:t xml:space="preserve"> Сла́ва Тобі́, Хри́сте Бо́же, упова́ння на́ше, сла́ва Тобі́!</w:t>
       </w:r>
     </w:p>
     <w:p>
@@ -6380,19 +6362,8 @@
           <w:szCs w:val="24"/>
           <w:rtl w:val="0"/>
         </w:rPr>
-        <w:t xml:space="preserve">Чесні́шу від херуви́мів* і незрівня́нно славні́шу від серафи́мів,* що без зотлі́ння Бо́га Сло́во породи́ла,* су́щу Богоро́дицю, тебе́ велича́ємо.</w:t>
-      </w:r>
-      <w:r>
-        <w:rPr>
-          <w:rtl w:val="0"/>
-        </w:rPr>
-      </w:r>
-    </w:p>
-    <w:p>
-      <w:pPr>
-        <w:spacing w:after="120" w:lineRule="auto"/>
-        <w:rPr/>
-      </w:pPr>
+        <w:t xml:space="preserve">Сла́ва Отцю́, і Си́ну, і Свято́му Ду́хові, і ни́ні, і повсякча́с, і на ві́ки вікі́в. Амі́нь. Го́споди, поми́луй. </w:t>
+      </w:r>
       <w:r>
         <w:rPr>
           <w:rFonts w:ascii="Times New Roman" w:cs="Times New Roman" w:eastAsia="Times New Roman" w:hAnsi="Times New Roman"/>
@@ -6402,26 +6373,64 @@
           <w:szCs w:val="24"/>
           <w:rtl w:val="0"/>
         </w:rPr>
-        <w:t xml:space="preserve">Священник:</w:t>
-      </w:r>
-      <w:r>
-        <w:rPr>
-          <w:rFonts w:ascii="Times New Roman" w:cs="Times New Roman" w:eastAsia="Times New Roman" w:hAnsi="Times New Roman"/>
-          <w:sz w:val="24"/>
-          <w:szCs w:val="24"/>
-          <w:rtl w:val="0"/>
-        </w:rPr>
-        <w:t xml:space="preserve"> Сла́ва Тобі́, Хри́сте Бо́же, упова́ння на́ше, сла́ва Тобі́!</w:t>
-      </w:r>
-      <w:r>
-        <w:rPr>
-          <w:rtl w:val="0"/>
-        </w:rPr>
-      </w:r>
-    </w:p>
-    <w:p>
-      <w:pPr>
-        <w:spacing w:after="120" w:lineRule="auto"/>
+        <w:t xml:space="preserve">(3 р.)</w:t>
+      </w:r>
+      <w:r>
+        <w:rPr>
+          <w:rFonts w:ascii="Times New Roman" w:cs="Times New Roman" w:eastAsia="Times New Roman" w:hAnsi="Times New Roman"/>
+          <w:sz w:val="24"/>
+          <w:szCs w:val="24"/>
+          <w:rtl w:val="0"/>
+        </w:rPr>
+        <w:t xml:space="preserve"> Благослови́.</w:t>
+      </w:r>
+      <w:r>
+        <w:rPr>
+          <w:rtl w:val="0"/>
+        </w:rPr>
+      </w:r>
+    </w:p>
+    <w:p>
+      <w:pPr>
+        <w:spacing w:after="120"/>
+      </w:pPr>
+      <w:r>
+        <w:rPr>
+          <w:rFonts w:ascii="Times New Roman" w:hAnsi="Times New Roman"/>
+          <w:i/>
+          <w:color w:val="FF0000"/>
+          <w:sz w:val="24"/>
+        </w:rPr>
+        <w:t>Священник:</w:t>
+      </w:r>
+      <w:r>
+        <w:rPr>
+          <w:rFonts w:ascii="Times New Roman" w:hAnsi="Times New Roman"/>
+          <w:sz w:val="24"/>
+        </w:rPr>
+        <w:t xml:space="preserve"> Христос, істинний Бог наш - молитвами пречистої Своєї Матері, заступництвом чесних небесних сил безтілесних, святих славних і всехвальних апостолів, і святого, </w:t>
+      </w:r>
+      <w:r>
+        <w:rPr>
+          <w:rFonts w:ascii="Times New Roman" w:hAnsi="Times New Roman"/>
+          <w:i/>
+          <w:color w:val="FF0000"/>
+          <w:sz w:val="24"/>
+        </w:rPr>
+        <w:t>якого є храм</w:t>
+      </w:r>
+      <w:r>
+        <w:rPr>
+          <w:rFonts w:ascii="Times New Roman" w:hAnsi="Times New Roman"/>
+          <w:sz w:val="24"/>
+        </w:rPr>
+        <w:t>, і святого пророка Аввакума, блаженного священномученика Івана Слезюка, єпископа,, і всіх святих - помилує і спасе нас як благий і людинолюбний.</w:t>
+      </w:r>
+    </w:p>
+    <w:p>
+      <w:pPr>
+        <w:spacing w:after="120" w:lineRule="auto"/>
+        <w:jc w:val="both"/>
         <w:rPr/>
       </w:pPr>
       <w:r>
@@ -6452,27 +6461,40 @@
           <w:szCs w:val="24"/>
           <w:rtl w:val="0"/>
         </w:rPr>
-        <w:t xml:space="preserve">Сла́ва Отцю́, і Си́ну, і Свято́му Ду́хові, і ни́ні, і повсякча́с, і на ві́ки вікі́в. Амі́нь. Го́споди, поми́луй. </w:t>
-      </w:r>
+        <w:t xml:space="preserve">Амінь.</w:t>
+      </w:r>
+      <w:r>
+        <w:rPr>
+          <w:rtl w:val="0"/>
+        </w:rPr>
+      </w:r>
+    </w:p>
+    <w:p>
+      <w:pPr>
+        <w:spacing w:after="120" w:lineRule="auto"/>
+        <w:rPr/>
+      </w:pPr>
+      <w:r>
+        <w:rPr>
+          <w:rtl w:val="0"/>
+        </w:rPr>
+      </w:r>
+    </w:p>
+    <w:p>
+      <w:pPr>
+        <w:pStyle w:val="Heading3"/>
+        <w:spacing w:after="120" w:lineRule="auto"/>
+        <w:jc w:val="center"/>
+        <w:rPr/>
+      </w:pPr>
       <w:r>
         <w:rPr>
           <w:rFonts w:ascii="Times New Roman" w:cs="Times New Roman" w:eastAsia="Times New Roman" w:hAnsi="Times New Roman"/>
           <w:i w:val="1"/>
           <w:color w:val="ff0000"/>
-          <w:sz w:val="24"/>
-          <w:szCs w:val="24"/>
-          <w:rtl w:val="0"/>
-        </w:rPr>
-        <w:t xml:space="preserve">(3 р.)</w:t>
-      </w:r>
-      <w:r>
-        <w:rPr>
-          <w:rFonts w:ascii="Times New Roman" w:cs="Times New Roman" w:eastAsia="Times New Roman" w:hAnsi="Times New Roman"/>
-          <w:sz w:val="24"/>
-          <w:szCs w:val="24"/>
-          <w:rtl w:val="0"/>
-        </w:rPr>
-        <w:t xml:space="preserve"> Благослови́.</w:t>
+          <w:rtl w:val="0"/>
+        </w:rPr>
+        <w:t xml:space="preserve">Після Вечірні</w:t>
       </w:r>
       <w:r>
         <w:rPr>
@@ -6494,99 +6516,37 @@
           <w:szCs w:val="24"/>
           <w:rtl w:val="0"/>
         </w:rPr>
-        <w:t xml:space="preserve">Священник:</w:t>
-      </w:r>
-      <w:r>
-        <w:rPr>
-          <w:rFonts w:ascii="Times New Roman" w:cs="Times New Roman" w:eastAsia="Times New Roman" w:hAnsi="Times New Roman"/>
-          <w:sz w:val="24"/>
-          <w:szCs w:val="24"/>
-          <w:rtl w:val="0"/>
-        </w:rPr>
-        <w:t xml:space="preserve"> Христос, істинний Бог наш - молитвами пречистої Своєї Матері, заступництвом чесних небесних сил безтілесних, святих славних і всехвальних апостолів, і святого, </w:t>
-      </w:r>
-      <w:r>
-        <w:rPr>
-          <w:rFonts w:ascii="Times New Roman" w:cs="Times New Roman" w:eastAsia="Times New Roman" w:hAnsi="Times New Roman"/>
-          <w:i w:val="1"/>
-          <w:color w:val="ff0000"/>
-          <w:sz w:val="24"/>
-          <w:szCs w:val="24"/>
-          <w:rtl w:val="0"/>
-        </w:rPr>
-        <w:t xml:space="preserve">якого є храм</w:t>
-      </w:r>
-      <w:r>
-        <w:rPr>
-          <w:rFonts w:ascii="Times New Roman" w:cs="Times New Roman" w:eastAsia="Times New Roman" w:hAnsi="Times New Roman"/>
-          <w:sz w:val="24"/>
-          <w:szCs w:val="24"/>
-          <w:rtl w:val="0"/>
-        </w:rPr>
-        <w:t xml:space="preserve">, і святого пророка Аввакума, блаженного священномученика Івана Слезюка, єпископа,, і всіх святих - помилує і спасе нас як благий і людинолюбний.</w:t>
-      </w:r>
-      <w:r>
-        <w:rPr>
-          <w:rtl w:val="0"/>
-        </w:rPr>
-      </w:r>
-    </w:p>
-    <w:p>
-      <w:pPr>
-        <w:spacing w:after="120" w:lineRule="auto"/>
-        <w:jc w:val="both"/>
-        <w:rPr/>
-      </w:pPr>
-      <w:r>
-        <w:rPr>
-          <w:rFonts w:ascii="Times New Roman" w:cs="Times New Roman" w:eastAsia="Times New Roman" w:hAnsi="Times New Roman"/>
-          <w:i w:val="1"/>
-          <w:color w:val="ff0000"/>
-          <w:sz w:val="24"/>
-          <w:szCs w:val="24"/>
-          <w:rtl w:val="0"/>
-        </w:rPr>
         <w:t xml:space="preserve">Вірні:</w:t>
       </w:r>
       <w:r>
         <w:rPr>
           <w:rFonts w:ascii="Times New Roman" w:cs="Times New Roman" w:eastAsia="Times New Roman" w:hAnsi="Times New Roman"/>
-          <w:color w:val="ff0000"/>
-          <w:sz w:val="24"/>
-          <w:szCs w:val="24"/>
-          <w:rtl w:val="0"/>
-        </w:rPr>
-        <w:t xml:space="preserve"> </w:t>
-      </w:r>
-      <w:r>
-        <w:rPr>
-          <w:rFonts w:ascii="Times New Roman" w:cs="Times New Roman" w:eastAsia="Times New Roman" w:hAnsi="Times New Roman"/>
-          <w:sz w:val="24"/>
-          <w:szCs w:val="24"/>
-          <w:rtl w:val="0"/>
-        </w:rPr>
-        <w:t xml:space="preserve">Амінь.</w:t>
-      </w:r>
-      <w:r>
-        <w:rPr>
-          <w:rtl w:val="0"/>
-        </w:rPr>
-      </w:r>
-    </w:p>
-    <w:p>
-      <w:pPr>
-        <w:spacing w:after="120" w:lineRule="auto"/>
-        <w:rPr/>
-      </w:pPr>
-      <w:r>
-        <w:rPr>
-          <w:rtl w:val="0"/>
-        </w:rPr>
-      </w:r>
-    </w:p>
-    <w:p>
-      <w:pPr>
-        <w:pStyle w:val="Heading3"/>
+          <w:sz w:val="24"/>
+          <w:szCs w:val="24"/>
+          <w:rtl w:val="0"/>
+        </w:rPr>
+        <w:t xml:space="preserve"> Під твою́ ми́лість прибіга́ємо, Богоро́дице Ді́во;* молитва́ми на́шими в скорбо́тах не погорди́,* але́ від бід ви́зволи нас, єди́на чи́ста і благослове́нна.</w:t>
+      </w:r>
+      <w:r>
+        <w:rPr>
+          <w:rtl w:val="0"/>
+        </w:rPr>
+      </w:r>
+    </w:p>
+    <w:p>
+      <w:pPr>
+        <w:spacing w:after="120" w:lineRule="auto"/>
+        <w:rPr/>
+      </w:pPr>
+      <w:r>
+        <w:rPr>
+          <w:rtl w:val="0"/>
+        </w:rPr>
+      </w:r>
+    </w:p>
+    <w:p>
+      <w:pPr>
+        <w:pStyle w:val="Heading1"/>
         <w:spacing w:after="120" w:lineRule="auto"/>
         <w:jc w:val="center"/>
         <w:rPr/>
@@ -6594,70 +6554,6 @@
       <w:r>
         <w:rPr>
           <w:rFonts w:ascii="Times New Roman" w:cs="Times New Roman" w:eastAsia="Times New Roman" w:hAnsi="Times New Roman"/>
-          <w:i w:val="1"/>
-          <w:color w:val="ff0000"/>
-          <w:rtl w:val="0"/>
-        </w:rPr>
-        <w:t xml:space="preserve">Після Вечірні</w:t>
-      </w:r>
-      <w:r>
-        <w:rPr>
-          <w:rtl w:val="0"/>
-        </w:rPr>
-      </w:r>
-    </w:p>
-    <w:p>
-      <w:pPr>
-        <w:spacing w:after="120" w:lineRule="auto"/>
-        <w:rPr/>
-      </w:pPr>
-      <w:r>
-        <w:rPr>
-          <w:rFonts w:ascii="Times New Roman" w:cs="Times New Roman" w:eastAsia="Times New Roman" w:hAnsi="Times New Roman"/>
-          <w:i w:val="1"/>
-          <w:color w:val="ff0000"/>
-          <w:sz w:val="24"/>
-          <w:szCs w:val="24"/>
-          <w:rtl w:val="0"/>
-        </w:rPr>
-        <w:t xml:space="preserve">Вірні:</w:t>
-      </w:r>
-      <w:r>
-        <w:rPr>
-          <w:rFonts w:ascii="Times New Roman" w:cs="Times New Roman" w:eastAsia="Times New Roman" w:hAnsi="Times New Roman"/>
-          <w:sz w:val="24"/>
-          <w:szCs w:val="24"/>
-          <w:rtl w:val="0"/>
-        </w:rPr>
-        <w:t xml:space="preserve"> Під твою́ ми́лість прибіга́ємо, Богоро́дице Ді́во;* молитва́ми на́шими в скорбо́тах не погорди́,* але́ від бід ви́зволи нас, єди́на чи́ста і благослове́нна.</w:t>
-      </w:r>
-      <w:r>
-        <w:rPr>
-          <w:rtl w:val="0"/>
-        </w:rPr>
-      </w:r>
-    </w:p>
-    <w:p>
-      <w:pPr>
-        <w:spacing w:after="120" w:lineRule="auto"/>
-        <w:rPr/>
-      </w:pPr>
-      <w:r>
-        <w:rPr>
-          <w:rtl w:val="0"/>
-        </w:rPr>
-      </w:r>
-    </w:p>
-    <w:p>
-      <w:pPr>
-        <w:pStyle w:val="Heading1"/>
-        <w:spacing w:after="120" w:lineRule="auto"/>
-        <w:jc w:val="center"/>
-        <w:rPr/>
-      </w:pPr>
-      <w:r>
-        <w:rPr>
-          <w:rFonts w:ascii="Times New Roman" w:cs="Times New Roman" w:eastAsia="Times New Roman" w:hAnsi="Times New Roman"/>
           <w:rtl w:val="0"/>
         </w:rPr>
         <w:t xml:space="preserve">УТРЕНЯ</w:t>
@@ -6676,28 +6572,19 @@
       </w:pPr>
       <w:r>
         <w:rPr>
-          <w:rFonts w:ascii="Times New Roman" w:cs="Times New Roman" w:eastAsia="Times New Roman" w:hAnsi="Times New Roman"/>
-          <w:i w:val="1"/>
-          <w:color w:val="ff0000"/>
-          <w:sz w:val="24"/>
-          <w:szCs w:val="24"/>
-          <w:rtl w:val="0"/>
-        </w:rPr>
-        <w:t xml:space="preserve">Священник:</w:t>
-      </w:r>
-      <w:r>
-        <w:rPr>
-          <w:rFonts w:ascii="Times New Roman" w:cs="Times New Roman" w:eastAsia="Times New Roman" w:hAnsi="Times New Roman"/>
-          <w:sz w:val="24"/>
-          <w:szCs w:val="24"/>
-          <w:rtl w:val="0"/>
+          <w:rFonts w:ascii="Times New Roman" w:hAnsi="Times New Roman"/>
+          <w:i/>
+          <w:color w:val="FF0000"/>
+          <w:sz w:val="24"/>
+        </w:rPr>
+        <w:t>Священник:</w:t>
+      </w:r>
+      <w:r>
+        <w:rPr>
+          <w:rFonts w:ascii="Times New Roman" w:hAnsi="Times New Roman"/>
+          <w:sz w:val="24"/>
         </w:rPr>
         <w:t xml:space="preserve"> Слава святій, одноістотній, животворчій і нероздільній Тройці, завжди, нині і повсякчас, і на віки віків.</w:t>
-      </w:r>
-      <w:r>
-        <w:rPr>
-          <w:rtl w:val="0"/>
-        </w:rPr>
       </w:r>
     </w:p>
     <w:p>
@@ -10433,28 +10320,19 @@
       </w:pPr>
       <w:r>
         <w:rPr>
-          <w:rFonts w:ascii="Times New Roman" w:cs="Times New Roman" w:eastAsia="Times New Roman" w:hAnsi="Times New Roman"/>
-          <w:i w:val="1"/>
-          <w:color w:val="ff0000"/>
-          <w:sz w:val="24"/>
-          <w:szCs w:val="24"/>
-          <w:rtl w:val="0"/>
-        </w:rPr>
-        <w:t xml:space="preserve">Священник:</w:t>
-      </w:r>
-      <w:r>
-        <w:rPr>
-          <w:rFonts w:ascii="Times New Roman" w:cs="Times New Roman" w:eastAsia="Times New Roman" w:hAnsi="Times New Roman"/>
-          <w:sz w:val="24"/>
-          <w:szCs w:val="24"/>
-          <w:rtl w:val="0"/>
+          <w:rFonts w:ascii="Times New Roman" w:hAnsi="Times New Roman"/>
+          <w:i/>
+          <w:color w:val="FF0000"/>
+          <w:sz w:val="24"/>
+        </w:rPr>
+        <w:t>Священник:</w:t>
+      </w:r>
+      <w:r>
+        <w:rPr>
+          <w:rFonts w:ascii="Times New Roman" w:hAnsi="Times New Roman"/>
+          <w:sz w:val="24"/>
         </w:rPr>
         <w:t xml:space="preserve"> Бо Тобі належить усяка слава, честь і поклоніння, Отцю, і Сину, і Святому Духові, нині, і повсякчас, і на віки віків.</w:t>
-      </w:r>
-      <w:r>
-        <w:rPr>
-          <w:rtl w:val="0"/>
-        </w:rPr>
       </w:r>
     </w:p>
     <w:p>
@@ -11064,28 +10942,19 @@
       </w:pPr>
       <w:r>
         <w:rPr>
-          <w:rFonts w:ascii="Times New Roman" w:cs="Times New Roman" w:eastAsia="Times New Roman" w:hAnsi="Times New Roman"/>
-          <w:i w:val="1"/>
-          <w:color w:val="ff0000"/>
-          <w:sz w:val="24"/>
-          <w:szCs w:val="24"/>
-          <w:rtl w:val="0"/>
-        </w:rPr>
-        <w:t xml:space="preserve">Священник:</w:t>
-      </w:r>
-      <w:r>
-        <w:rPr>
-          <w:rFonts w:ascii="Times New Roman" w:cs="Times New Roman" w:eastAsia="Times New Roman" w:hAnsi="Times New Roman"/>
-          <w:sz w:val="24"/>
-          <w:szCs w:val="24"/>
-          <w:rtl w:val="0"/>
+          <w:rFonts w:ascii="Times New Roman" w:hAnsi="Times New Roman"/>
+          <w:i/>
+          <w:color w:val="FF0000"/>
+          <w:sz w:val="24"/>
+        </w:rPr>
+        <w:t>Священник:</w:t>
+      </w:r>
+      <w:r>
+        <w:rPr>
+          <w:rFonts w:ascii="Times New Roman" w:hAnsi="Times New Roman"/>
+          <w:sz w:val="24"/>
         </w:rPr>
         <w:t xml:space="preserve"> Бо Твоя є влада і Твоє є царство, і сила, і слава, Отця, і Сина, і Святого Духа, нині, і повсякчас, і на віки віків.</w:t>
-      </w:r>
-      <w:r>
-        <w:rPr>
-          <w:rtl w:val="0"/>
-        </w:rPr>
       </w:r>
     </w:p>
     <w:p>
@@ -11461,28 +11330,19 @@
       </w:pPr>
       <w:r>
         <w:rPr>
-          <w:rFonts w:ascii="Times New Roman" w:cs="Times New Roman" w:eastAsia="Times New Roman" w:hAnsi="Times New Roman"/>
-          <w:i w:val="1"/>
-          <w:color w:val="ff0000"/>
-          <w:sz w:val="24"/>
-          <w:szCs w:val="24"/>
-          <w:rtl w:val="0"/>
-        </w:rPr>
-        <w:t xml:space="preserve">Священник:</w:t>
-      </w:r>
-      <w:r>
-        <w:rPr>
-          <w:rFonts w:ascii="Times New Roman" w:cs="Times New Roman" w:eastAsia="Times New Roman" w:hAnsi="Times New Roman"/>
-          <w:sz w:val="24"/>
-          <w:szCs w:val="24"/>
-          <w:rtl w:val="0"/>
+          <w:rFonts w:ascii="Times New Roman" w:hAnsi="Times New Roman"/>
+          <w:i/>
+          <w:color w:val="FF0000"/>
+          <w:sz w:val="24"/>
+        </w:rPr>
+        <w:t>Священник:</w:t>
+      </w:r>
+      <w:r>
+        <w:rPr>
+          <w:rFonts w:ascii="Times New Roman" w:hAnsi="Times New Roman"/>
+          <w:sz w:val="24"/>
         </w:rPr>
         <w:t xml:space="preserve"> Бо Ти благий і людинолюбний Бог – і Тобі славу возсилаємо, Отцю, і Сину, і Святому Духові, нині, і повсякчас, і на віки віків.</w:t>
-      </w:r>
-      <w:r>
-        <w:rPr>
-          <w:rtl w:val="0"/>
-        </w:rPr>
       </w:r>
     </w:p>
     <w:p>
@@ -15247,28 +15107,19 @@
       </w:pPr>
       <w:r>
         <w:rPr>
-          <w:rFonts w:ascii="Times New Roman" w:cs="Times New Roman" w:eastAsia="Times New Roman" w:hAnsi="Times New Roman"/>
-          <w:i w:val="1"/>
-          <w:color w:val="ff0000"/>
-          <w:sz w:val="24"/>
-          <w:szCs w:val="24"/>
-          <w:rtl w:val="0"/>
-        </w:rPr>
-        <w:t xml:space="preserve">Священник:</w:t>
-      </w:r>
-      <w:r>
-        <w:rPr>
-          <w:rFonts w:ascii="Times New Roman" w:cs="Times New Roman" w:eastAsia="Times New Roman" w:hAnsi="Times New Roman"/>
-          <w:sz w:val="24"/>
-          <w:szCs w:val="24"/>
-          <w:rtl w:val="0"/>
+          <w:rFonts w:ascii="Times New Roman" w:hAnsi="Times New Roman"/>
+          <w:i/>
+          <w:color w:val="FF0000"/>
+          <w:sz w:val="24"/>
+        </w:rPr>
+        <w:t>Священник:</w:t>
+      </w:r>
+      <w:r>
+        <w:rPr>
+          <w:rFonts w:ascii="Times New Roman" w:hAnsi="Times New Roman"/>
+          <w:sz w:val="24"/>
         </w:rPr>
         <w:t xml:space="preserve"> Бо Тебе хвалять усі сили небесні і Тобі славу возсилаємо: Отцю, і Сину, і Святому Духові, нині і повсякчас, і на віки віків.</w:t>
-      </w:r>
-      <w:r>
-        <w:rPr>
-          <w:rtl w:val="0"/>
-        </w:rPr>
       </w:r>
     </w:p>
     <w:p>
@@ -16184,28 +16035,19 @@
       </w:pPr>
       <w:r>
         <w:rPr>
-          <w:rFonts w:ascii="Times New Roman" w:cs="Times New Roman" w:eastAsia="Times New Roman" w:hAnsi="Times New Roman"/>
-          <w:i w:val="1"/>
-          <w:color w:val="ff0000"/>
-          <w:sz w:val="24"/>
-          <w:szCs w:val="24"/>
-          <w:rtl w:val="0"/>
-        </w:rPr>
-        <w:t xml:space="preserve">Священник:</w:t>
-      </w:r>
-      <w:r>
-        <w:rPr>
-          <w:rFonts w:ascii="Times New Roman" w:cs="Times New Roman" w:eastAsia="Times New Roman" w:hAnsi="Times New Roman"/>
-          <w:sz w:val="24"/>
-          <w:szCs w:val="24"/>
-          <w:rtl w:val="0"/>
+          <w:rFonts w:ascii="Times New Roman" w:hAnsi="Times New Roman"/>
+          <w:i/>
+          <w:color w:val="FF0000"/>
+          <w:sz w:val="24"/>
+        </w:rPr>
+        <w:t>Священник:</w:t>
+      </w:r>
+      <w:r>
+        <w:rPr>
+          <w:rFonts w:ascii="Times New Roman" w:hAnsi="Times New Roman"/>
+          <w:sz w:val="24"/>
         </w:rPr>
         <w:t xml:space="preserve"> Слава тобі, що Світло нам показав!</w:t>
-      </w:r>
-      <w:r>
-        <w:rPr>
-          <w:rtl w:val="0"/>
-        </w:rPr>
       </w:r>
     </w:p>
     <w:p>
@@ -17239,6 +17081,29 @@
       </w:pPr>
       <w:r>
         <w:rPr>
+          <w:rFonts w:ascii="Times New Roman" w:hAnsi="Times New Roman"/>
+          <w:i/>
+          <w:color w:val="FF0000"/>
+          <w:sz w:val="24"/>
+        </w:rPr>
+        <w:t>Священник:</w:t>
+      </w:r>
+      <w:r>
+        <w:rPr>
+          <w:rFonts w:ascii="Times New Roman" w:hAnsi="Times New Roman"/>
+          <w:sz w:val="24"/>
+        </w:rPr>
+        <w:t xml:space="preserve"> Бо Ти – Бог милости, ласк і людинолюбности, і Тобі славу возсилаємо, Отцю, і Сину, і Святому Духові, нині, і повсякчас, і на віки віків.</w:t>
+      </w:r>
+    </w:p>
+    <w:p>
+      <w:pPr>
+        <w:spacing w:after="120" w:lineRule="auto"/>
+        <w:jc w:val="both"/>
+        <w:rPr/>
+      </w:pPr>
+      <w:r>
+        <w:rPr>
           <w:rFonts w:ascii="Times New Roman" w:cs="Times New Roman" w:eastAsia="Times New Roman" w:hAnsi="Times New Roman"/>
           <w:i w:val="1"/>
           <w:color w:val="ff0000"/>
@@ -17246,21 +17111,54 @@
           <w:szCs w:val="24"/>
           <w:rtl w:val="0"/>
         </w:rPr>
-        <w:t xml:space="preserve">Священник:</w:t>
-      </w:r>
-      <w:r>
-        <w:rPr>
-          <w:rFonts w:ascii="Times New Roman" w:cs="Times New Roman" w:eastAsia="Times New Roman" w:hAnsi="Times New Roman"/>
-          <w:sz w:val="24"/>
-          <w:szCs w:val="24"/>
-          <w:rtl w:val="0"/>
-        </w:rPr>
-        <w:t xml:space="preserve"> Бо Ти – Бог милости, ласк і людинолюбности, і Тобі славу возсилаємо, Отцю, і Сину, і Святому Духові, нині, і повсякчас, і на віки віків.</w:t>
-      </w:r>
-      <w:r>
-        <w:rPr>
-          <w:rtl w:val="0"/>
-        </w:rPr>
+        <w:t xml:space="preserve">Вірні:</w:t>
+      </w:r>
+      <w:r>
+        <w:rPr>
+          <w:rFonts w:ascii="Times New Roman" w:cs="Times New Roman" w:eastAsia="Times New Roman" w:hAnsi="Times New Roman"/>
+          <w:color w:val="ff0000"/>
+          <w:sz w:val="24"/>
+          <w:szCs w:val="24"/>
+          <w:rtl w:val="0"/>
+        </w:rPr>
+        <w:t xml:space="preserve"> </w:t>
+      </w:r>
+      <w:r>
+        <w:rPr>
+          <w:rFonts w:ascii="Times New Roman" w:cs="Times New Roman" w:eastAsia="Times New Roman" w:hAnsi="Times New Roman"/>
+          <w:sz w:val="24"/>
+          <w:szCs w:val="24"/>
+          <w:rtl w:val="0"/>
+        </w:rPr>
+        <w:t xml:space="preserve">Амінь.</w:t>
+      </w:r>
+      <w:r>
+        <w:rPr>
+          <w:rtl w:val="0"/>
+        </w:rPr>
+      </w:r>
+    </w:p>
+    <w:p>
+      <w:pPr>
+        <w:spacing w:after="120" w:lineRule="auto"/>
+        <w:jc w:val="both"/>
+        <w:rPr/>
+      </w:pPr>
+      <w:r>
+        <w:rPr>
+          <w:rFonts w:ascii="Times New Roman" w:hAnsi="Times New Roman"/>
+          <w:i/>
+          <w:color w:val="FF0000"/>
+          <w:sz w:val="24"/>
+        </w:rPr>
+        <w:t>Священник:</w:t>
+      </w:r>
+      <w:r>
+        <w:rPr>
+          <w:rFonts w:ascii="Times New Roman" w:hAnsi="Times New Roman"/>
+          <w:sz w:val="24"/>
+        </w:rPr>
+        <w:t xml:space="preserve"> Мир всім.</w:t>
       </w:r>
     </w:p>
     <w:p>
@@ -17297,7 +17195,28 @@
           <w:szCs w:val="24"/>
           <w:rtl w:val="0"/>
         </w:rPr>
-        <w:t xml:space="preserve">Амінь.</w:t>
+        <w:t xml:space="preserve">І духові твоєму.</w:t>
+      </w:r>
+      <w:r>
+        <w:rPr>
+          <w:rtl w:val="0"/>
+        </w:rPr>
+      </w:r>
+    </w:p>
+    <w:p>
+      <w:pPr>
+        <w:spacing w:after="120" w:lineRule="auto"/>
+        <w:jc w:val="both"/>
+        <w:rPr/>
+      </w:pPr>
+      <w:r>
+        <w:rPr>
+          <w:rFonts w:ascii="Times New Roman" w:cs="Times New Roman" w:eastAsia="Times New Roman" w:hAnsi="Times New Roman"/>
+          <w:sz w:val="24"/>
+          <w:szCs w:val="24"/>
+          <w:rtl w:val="0"/>
+        </w:rPr>
+        <w:t xml:space="preserve">Голови ваші перед Господом схиліть.</w:t>
       </w:r>
       <w:r>
         <w:rPr>
@@ -17320,16 +17239,26 @@
           <w:szCs w:val="24"/>
           <w:rtl w:val="0"/>
         </w:rPr>
-        <w:t xml:space="preserve">Священник:</w:t>
-      </w:r>
-      <w:r>
-        <w:rPr>
-          <w:rFonts w:ascii="Times New Roman" w:cs="Times New Roman" w:eastAsia="Times New Roman" w:hAnsi="Times New Roman"/>
-          <w:sz w:val="24"/>
-          <w:szCs w:val="24"/>
-          <w:rtl w:val="0"/>
-        </w:rPr>
-        <w:t xml:space="preserve"> Мир всім.</w:t>
+        <w:t xml:space="preserve">Вірні:</w:t>
+      </w:r>
+      <w:r>
+        <w:rPr>
+          <w:rFonts w:ascii="Times New Roman" w:cs="Times New Roman" w:eastAsia="Times New Roman" w:hAnsi="Times New Roman"/>
+          <w:color w:val="ff0000"/>
+          <w:sz w:val="24"/>
+          <w:szCs w:val="24"/>
+          <w:rtl w:val="0"/>
+        </w:rPr>
+        <w:t xml:space="preserve"> </w:t>
+      </w:r>
+      <w:r>
+        <w:rPr>
+          <w:rFonts w:ascii="Times New Roman" w:cs="Times New Roman" w:eastAsia="Times New Roman" w:hAnsi="Times New Roman"/>
+          <w:sz w:val="24"/>
+          <w:szCs w:val="24"/>
+          <w:rtl w:val="0"/>
+        </w:rPr>
+        <w:t xml:space="preserve">Тобі, Господи.</w:t>
       </w:r>
       <w:r>
         <w:rPr>
@@ -17352,111 +17281,6 @@
           <w:szCs w:val="24"/>
           <w:rtl w:val="0"/>
         </w:rPr>
-        <w:t xml:space="preserve">Вірні:</w:t>
-      </w:r>
-      <w:r>
-        <w:rPr>
-          <w:rFonts w:ascii="Times New Roman" w:cs="Times New Roman" w:eastAsia="Times New Roman" w:hAnsi="Times New Roman"/>
-          <w:color w:val="ff0000"/>
-          <w:sz w:val="24"/>
-          <w:szCs w:val="24"/>
-          <w:rtl w:val="0"/>
-        </w:rPr>
-        <w:t xml:space="preserve"> </w:t>
-      </w:r>
-      <w:r>
-        <w:rPr>
-          <w:rFonts w:ascii="Times New Roman" w:cs="Times New Roman" w:eastAsia="Times New Roman" w:hAnsi="Times New Roman"/>
-          <w:sz w:val="24"/>
-          <w:szCs w:val="24"/>
-          <w:rtl w:val="0"/>
-        </w:rPr>
-        <w:t xml:space="preserve">І духові твоєму.</w:t>
-      </w:r>
-      <w:r>
-        <w:rPr>
-          <w:rtl w:val="0"/>
-        </w:rPr>
-      </w:r>
-    </w:p>
-    <w:p>
-      <w:pPr>
-        <w:spacing w:after="120" w:lineRule="auto"/>
-        <w:jc w:val="both"/>
-        <w:rPr/>
-      </w:pPr>
-      <w:r>
-        <w:rPr>
-          <w:rFonts w:ascii="Times New Roman" w:cs="Times New Roman" w:eastAsia="Times New Roman" w:hAnsi="Times New Roman"/>
-          <w:sz w:val="24"/>
-          <w:szCs w:val="24"/>
-          <w:rtl w:val="0"/>
-        </w:rPr>
-        <w:t xml:space="preserve">Голови ваші перед Господом схиліть.</w:t>
-      </w:r>
-      <w:r>
-        <w:rPr>
-          <w:rtl w:val="0"/>
-        </w:rPr>
-      </w:r>
-    </w:p>
-    <w:p>
-      <w:pPr>
-        <w:spacing w:after="120" w:lineRule="auto"/>
-        <w:jc w:val="both"/>
-        <w:rPr/>
-      </w:pPr>
-      <w:r>
-        <w:rPr>
-          <w:rFonts w:ascii="Times New Roman" w:cs="Times New Roman" w:eastAsia="Times New Roman" w:hAnsi="Times New Roman"/>
-          <w:i w:val="1"/>
-          <w:color w:val="ff0000"/>
-          <w:sz w:val="24"/>
-          <w:szCs w:val="24"/>
-          <w:rtl w:val="0"/>
-        </w:rPr>
-        <w:t xml:space="preserve">Вірні:</w:t>
-      </w:r>
-      <w:r>
-        <w:rPr>
-          <w:rFonts w:ascii="Times New Roman" w:cs="Times New Roman" w:eastAsia="Times New Roman" w:hAnsi="Times New Roman"/>
-          <w:color w:val="ff0000"/>
-          <w:sz w:val="24"/>
-          <w:szCs w:val="24"/>
-          <w:rtl w:val="0"/>
-        </w:rPr>
-        <w:t xml:space="preserve"> </w:t>
-      </w:r>
-      <w:r>
-        <w:rPr>
-          <w:rFonts w:ascii="Times New Roman" w:cs="Times New Roman" w:eastAsia="Times New Roman" w:hAnsi="Times New Roman"/>
-          <w:sz w:val="24"/>
-          <w:szCs w:val="24"/>
-          <w:rtl w:val="0"/>
-        </w:rPr>
-        <w:t xml:space="preserve">Тобі, Господи.</w:t>
-      </w:r>
-      <w:r>
-        <w:rPr>
-          <w:rtl w:val="0"/>
-        </w:rPr>
-      </w:r>
-    </w:p>
-    <w:p>
-      <w:pPr>
-        <w:spacing w:after="120" w:lineRule="auto"/>
-        <w:jc w:val="both"/>
-        <w:rPr/>
-      </w:pPr>
-      <w:r>
-        <w:rPr>
-          <w:rFonts w:ascii="Times New Roman" w:cs="Times New Roman" w:eastAsia="Times New Roman" w:hAnsi="Times New Roman"/>
-          <w:i w:val="1"/>
-          <w:color w:val="ff0000"/>
-          <w:sz w:val="24"/>
-          <w:szCs w:val="24"/>
-          <w:rtl w:val="0"/>
-        </w:rPr>
         <w:t xml:space="preserve">Священник читає молитву:</w:t>
       </w:r>
       <w:r>
@@ -17481,28 +17305,19 @@
       </w:pPr>
       <w:r>
         <w:rPr>
-          <w:rFonts w:ascii="Times New Roman" w:cs="Times New Roman" w:eastAsia="Times New Roman" w:hAnsi="Times New Roman"/>
-          <w:i w:val="1"/>
-          <w:color w:val="ff0000"/>
-          <w:sz w:val="24"/>
-          <w:szCs w:val="24"/>
-          <w:rtl w:val="0"/>
-        </w:rPr>
-        <w:t xml:space="preserve">Священник:</w:t>
-      </w:r>
-      <w:r>
-        <w:rPr>
-          <w:rFonts w:ascii="Times New Roman" w:cs="Times New Roman" w:eastAsia="Times New Roman" w:hAnsi="Times New Roman"/>
-          <w:sz w:val="24"/>
-          <w:szCs w:val="24"/>
-          <w:rtl w:val="0"/>
+          <w:rFonts w:ascii="Times New Roman" w:hAnsi="Times New Roman"/>
+          <w:i/>
+          <w:color w:val="FF0000"/>
+          <w:sz w:val="24"/>
+        </w:rPr>
+        <w:t>Священник:</w:t>
+      </w:r>
+      <w:r>
+        <w:rPr>
+          <w:rFonts w:ascii="Times New Roman" w:hAnsi="Times New Roman"/>
+          <w:sz w:val="24"/>
         </w:rPr>
         <w:t xml:space="preserve"> Бо до Тебе належить милувати і спасати нас, Боже наш, і Тобі славу возсилаємо, Отцю, і Сину, і Святому Духові, нині, і повсякчас, і на віки віків.</w:t>
-      </w:r>
-      <w:r>
-        <w:rPr>
-          <w:rtl w:val="0"/>
-        </w:rPr>
       </w:r>
     </w:p>
     <w:p>
@@ -18001,28 +17816,19 @@
       </w:pPr>
       <w:r>
         <w:rPr>
-          <w:rFonts w:ascii="Times New Roman" w:cs="Times New Roman" w:eastAsia="Times New Roman" w:hAnsi="Times New Roman"/>
-          <w:i w:val="1"/>
-          <w:color w:val="ff0000"/>
-          <w:sz w:val="24"/>
-          <w:szCs w:val="24"/>
-          <w:rtl w:val="0"/>
-        </w:rPr>
-        <w:t xml:space="preserve">Священник:</w:t>
-      </w:r>
-      <w:r>
-        <w:rPr>
-          <w:rFonts w:ascii="Times New Roman" w:cs="Times New Roman" w:eastAsia="Times New Roman" w:hAnsi="Times New Roman"/>
-          <w:sz w:val="24"/>
-          <w:szCs w:val="24"/>
-          <w:rtl w:val="0"/>
+          <w:rFonts w:ascii="Times New Roman" w:hAnsi="Times New Roman"/>
+          <w:i/>
+          <w:color w:val="FF0000"/>
+          <w:sz w:val="24"/>
+        </w:rPr>
+        <w:t>Священник:</w:t>
+      </w:r>
+      <w:r>
+        <w:rPr>
+          <w:rFonts w:ascii="Times New Roman" w:hAnsi="Times New Roman"/>
+          <w:sz w:val="24"/>
         </w:rPr>
         <w:t xml:space="preserve"> Бо Твоє є царство, і сила, і слава, Отця, і Сина, і Святого Духа, нині, і повсякчас, і на віки віків.</w:t>
-      </w:r>
-      <w:r>
-        <w:rPr>
-          <w:rtl w:val="0"/>
-        </w:rPr>
       </w:r>
     </w:p>
     <w:p>
@@ -18541,28 +18347,19 @@
       </w:pPr>
       <w:r>
         <w:rPr>
-          <w:rFonts w:ascii="Times New Roman" w:cs="Times New Roman" w:eastAsia="Times New Roman" w:hAnsi="Times New Roman"/>
-          <w:i w:val="1"/>
-          <w:color w:val="ff0000"/>
-          <w:sz w:val="24"/>
-          <w:szCs w:val="24"/>
-          <w:rtl w:val="0"/>
-        </w:rPr>
-        <w:t xml:space="preserve">Священник:</w:t>
-      </w:r>
-      <w:r>
-        <w:rPr>
-          <w:rFonts w:ascii="Times New Roman" w:cs="Times New Roman" w:eastAsia="Times New Roman" w:hAnsi="Times New Roman"/>
-          <w:sz w:val="24"/>
-          <w:szCs w:val="24"/>
-          <w:rtl w:val="0"/>
+          <w:rFonts w:ascii="Times New Roman" w:hAnsi="Times New Roman"/>
+          <w:i/>
+          <w:color w:val="FF0000"/>
+          <w:sz w:val="24"/>
+        </w:rPr>
+        <w:t>Священник:</w:t>
+      </w:r>
+      <w:r>
+        <w:rPr>
+          <w:rFonts w:ascii="Times New Roman" w:hAnsi="Times New Roman"/>
+          <w:sz w:val="24"/>
         </w:rPr>
         <w:t xml:space="preserve"> Бо милостивий і людинолюбний Бог єси, і Тобі славу возсилаємо, Отцю, і Сину, і Святому Духові, нині, і повсякчас, і на віки віків.</w:t>
-      </w:r>
-      <w:r>
-        <w:rPr>
-          <w:rtl w:val="0"/>
-        </w:rPr>
       </w:r>
     </w:p>
     <w:p>
@@ -18701,6 +18498,28 @@
       </w:pPr>
       <w:r>
         <w:rPr>
+          <w:rFonts w:ascii="Times New Roman" w:hAnsi="Times New Roman"/>
+          <w:i/>
+          <w:color w:val="FF0000"/>
+          <w:sz w:val="24"/>
+        </w:rPr>
+        <w:t>Священник:</w:t>
+      </w:r>
+      <w:r>
+        <w:rPr>
+          <w:rFonts w:ascii="Times New Roman" w:hAnsi="Times New Roman"/>
+          <w:sz w:val="24"/>
+        </w:rPr>
+        <w:t xml:space="preserve"> Сла́ва Тобі́, Хри́сте Бо́же, упова́ння на́ше, сла́ва Тобі́!</w:t>
+      </w:r>
+    </w:p>
+    <w:p>
+      <w:pPr>
+        <w:spacing w:after="120" w:lineRule="auto"/>
+        <w:rPr/>
+      </w:pPr>
+      <w:r>
+        <w:rPr>
           <w:rFonts w:ascii="Times New Roman" w:cs="Times New Roman" w:eastAsia="Times New Roman" w:hAnsi="Times New Roman"/>
           <w:i w:val="1"/>
           <w:color w:val="ff0000"/>
@@ -18708,28 +18527,27 @@
           <w:szCs w:val="24"/>
           <w:rtl w:val="0"/>
         </w:rPr>
-        <w:t xml:space="preserve">Священник:</w:t>
-      </w:r>
-      <w:r>
-        <w:rPr>
-          <w:rFonts w:ascii="Times New Roman" w:cs="Times New Roman" w:eastAsia="Times New Roman" w:hAnsi="Times New Roman"/>
-          <w:sz w:val="24"/>
-          <w:szCs w:val="24"/>
-          <w:rtl w:val="0"/>
-        </w:rPr>
-        <w:t xml:space="preserve"> Сла́ва Тобі́, Хри́сте Бо́же, упова́ння на́ше, сла́ва Тобі́!</w:t>
-      </w:r>
-      <w:r>
-        <w:rPr>
-          <w:rtl w:val="0"/>
-        </w:rPr>
-      </w:r>
-    </w:p>
-    <w:p>
-      <w:pPr>
-        <w:spacing w:after="120" w:lineRule="auto"/>
-        <w:rPr/>
-      </w:pPr>
+        <w:t xml:space="preserve">Вірні:</w:t>
+      </w:r>
+      <w:r>
+        <w:rPr>
+          <w:rFonts w:ascii="Times New Roman" w:cs="Times New Roman" w:eastAsia="Times New Roman" w:hAnsi="Times New Roman"/>
+          <w:color w:val="ff0000"/>
+          <w:sz w:val="24"/>
+          <w:szCs w:val="24"/>
+          <w:rtl w:val="0"/>
+        </w:rPr>
+        <w:t xml:space="preserve"> </w:t>
+      </w:r>
+      <w:r>
+        <w:rPr>
+          <w:rFonts w:ascii="Times New Roman" w:cs="Times New Roman" w:eastAsia="Times New Roman" w:hAnsi="Times New Roman"/>
+          <w:sz w:val="24"/>
+          <w:szCs w:val="24"/>
+          <w:rtl w:val="0"/>
+        </w:rPr>
+        <w:t xml:space="preserve">Сла́ва Отцю́, і Си́ну, і Свято́му Ду́хові, і ни́ні, і повсякча́с, і на ві́ки вікі́в. Амі́нь. Го́споди, поми́луй. </w:t>
+      </w:r>
       <w:r>
         <w:rPr>
           <w:rFonts w:ascii="Times New Roman" w:cs="Times New Roman" w:eastAsia="Times New Roman" w:hAnsi="Times New Roman"/>
@@ -18739,36 +18557,6 @@
           <w:szCs w:val="24"/>
           <w:rtl w:val="0"/>
         </w:rPr>
-        <w:t xml:space="preserve">Вірні:</w:t>
-      </w:r>
-      <w:r>
-        <w:rPr>
-          <w:rFonts w:ascii="Times New Roman" w:cs="Times New Roman" w:eastAsia="Times New Roman" w:hAnsi="Times New Roman"/>
-          <w:color w:val="ff0000"/>
-          <w:sz w:val="24"/>
-          <w:szCs w:val="24"/>
-          <w:rtl w:val="0"/>
-        </w:rPr>
-        <w:t xml:space="preserve"> </w:t>
-      </w:r>
-      <w:r>
-        <w:rPr>
-          <w:rFonts w:ascii="Times New Roman" w:cs="Times New Roman" w:eastAsia="Times New Roman" w:hAnsi="Times New Roman"/>
-          <w:sz w:val="24"/>
-          <w:szCs w:val="24"/>
-          <w:rtl w:val="0"/>
-        </w:rPr>
-        <w:t xml:space="preserve">Сла́ва Отцю́, і Си́ну, і Свято́му Ду́хові, і ни́ні, і повсякча́с, і на ві́ки вікі́в. Амі́нь. Го́споди, поми́луй. </w:t>
-      </w:r>
-      <w:r>
-        <w:rPr>
-          <w:rFonts w:ascii="Times New Roman" w:cs="Times New Roman" w:eastAsia="Times New Roman" w:hAnsi="Times New Roman"/>
-          <w:i w:val="1"/>
-          <w:color w:val="ff0000"/>
-          <w:sz w:val="24"/>
-          <w:szCs w:val="24"/>
-          <w:rtl w:val="0"/>
-        </w:rPr>
         <w:t xml:space="preserve">(3 р.)</w:t>
       </w:r>
       <w:r>
@@ -18788,54 +18576,39 @@
     </w:p>
     <w:p>
       <w:pPr>
-        <w:spacing w:after="120" w:lineRule="auto"/>
-        <w:jc w:val="both"/>
-        <w:rPr/>
-      </w:pPr>
-      <w:r>
-        <w:rPr>
-          <w:rFonts w:ascii="Times New Roman" w:cs="Times New Roman" w:eastAsia="Times New Roman" w:hAnsi="Times New Roman"/>
-          <w:i w:val="1"/>
-          <w:color w:val="ff0000"/>
-          <w:sz w:val="24"/>
-          <w:szCs w:val="24"/>
-          <w:rtl w:val="0"/>
-        </w:rPr>
-        <w:t xml:space="preserve">Священник:</w:t>
-      </w:r>
-      <w:r>
-        <w:rPr>
-          <w:rFonts w:ascii="Times New Roman" w:cs="Times New Roman" w:eastAsia="Times New Roman" w:hAnsi="Times New Roman"/>
-          <w:sz w:val="24"/>
-          <w:szCs w:val="24"/>
-          <w:rtl w:val="0"/>
+        <w:spacing w:after="120"/>
+      </w:pPr>
+      <w:r>
+        <w:rPr>
+          <w:rFonts w:ascii="Times New Roman" w:hAnsi="Times New Roman"/>
+          <w:i/>
+          <w:color w:val="FF0000"/>
+          <w:sz w:val="24"/>
+        </w:rPr>
+        <w:t>Священник:</w:t>
+      </w:r>
+      <w:r>
+        <w:rPr>
+          <w:rFonts w:ascii="Times New Roman" w:hAnsi="Times New Roman"/>
+          <w:sz w:val="24"/>
         </w:rPr>
         <w:t xml:space="preserve"> Христос, істинний Бог наш - молитвами пречистої Своєї Матері, заступництвом чесних небесних сил безтілесних, святих славних і всехвальних апостолів, і святого, </w:t>
       </w:r>
       <w:r>
         <w:rPr>
-          <w:rFonts w:ascii="Times New Roman" w:cs="Times New Roman" w:eastAsia="Times New Roman" w:hAnsi="Times New Roman"/>
-          <w:i w:val="1"/>
-          <w:color w:val="ff0000"/>
-          <w:sz w:val="24"/>
-          <w:szCs w:val="24"/>
-          <w:rtl w:val="0"/>
-        </w:rPr>
-        <w:t xml:space="preserve">якого є храм</w:t>
-      </w:r>
-      <w:r>
-        <w:rPr>
-          <w:rFonts w:ascii="Times New Roman" w:cs="Times New Roman" w:eastAsia="Times New Roman" w:hAnsi="Times New Roman"/>
-          <w:sz w:val="24"/>
-          <w:szCs w:val="24"/>
-          <w:rtl w:val="0"/>
-        </w:rPr>
-        <w:t xml:space="preserve">, і святого пророка Аввакума, блаженного священномученика Івана Слезюка, єпископа, і всіх святих - помилує і спасе нас як благий і людинолюбний.</w:t>
-      </w:r>
-      <w:r>
-        <w:rPr>
-          <w:rtl w:val="0"/>
-        </w:rPr>
+          <w:rFonts w:ascii="Times New Roman" w:hAnsi="Times New Roman"/>
+          <w:i/>
+          <w:color w:val="FF0000"/>
+          <w:sz w:val="24"/>
+        </w:rPr>
+        <w:t>якого є храм</w:t>
+      </w:r>
+      <w:r>
+        <w:rPr>
+          <w:rFonts w:ascii="Times New Roman" w:hAnsi="Times New Roman"/>
+          <w:sz w:val="24"/>
+        </w:rPr>
+        <w:t>, і святого пророка Аввакума, блаженного священномученика Івана Слезюка, єпископа,, і всіх святих - помилує і спасе нас як благий і людинолюбний.</w:t>
       </w:r>
     </w:p>
     <w:p>

</xml_diff>